<commit_message>
Refine application partner language
</commit_message>
<xml_diff>
--- a/docs/applications/accelicity-knight-application-draft.docx
+++ b/docs/applications/accelicity-knight-application-draft.docx
@@ -1242,7 +1242,7 @@
           <w:sz w:val="24"/>
           <w:sz-cs w:val="24"/>
         </w:rPr>
-        <w:t xml:space="preserve">Insert confirmed organization names once approved. Below is a recommended structure.</w:t>
+        <w:t xml:space="preserve">We have identified an initial set of ideal pilot partner organizations based on project feedback, exploratory conversations, and early expressions of interest. These include:</w:t>
       </w:r>
     </w:p>
     <w:p>
@@ -1309,6 +1309,28 @@
           <w:sz-cs w:val="24"/>
         </w:rPr>
         <w:t xml:space="preserve">- Community-based organizations: help recruit participants, ground the pilot in local needs, and ensure the model remains community-legible and accessible.</w:t>
+      </w:r>
+    </w:p>
+    <w:p>
+      <w:pPr/>
+      <w:r>
+        <w:rPr>
+          <w:rFonts w:ascii="Helvetica Light" w:hAnsi="Helvetica Light" w:cs="Helvetica Light"/>
+          <w:sz w:val="24"/>
+          <w:sz-cs w:val="24"/>
+        </w:rPr>
+        <w:t xml:space="preserve"/>
+      </w:r>
+    </w:p>
+    <w:p>
+      <w:pPr/>
+      <w:r>
+        <w:rPr>
+          <w:rFonts w:ascii="Helvetica Light" w:hAnsi="Helvetica Light" w:cs="Helvetica Light"/>
+          <w:sz w:val="24"/>
+          <w:sz-cs w:val="24"/>
+        </w:rPr>
+        <w:t xml:space="preserve">As the pilot advances, these relationships will be formalized around specific operational roles, local use cases, and governance needs.</w:t>
       </w:r>
     </w:p>
     <w:p>

</xml_diff>

<commit_message>
Align Knight response with focus areas
</commit_message>
<xml_diff>
--- a/docs/applications/accelicity-knight-application-draft.docx
+++ b/docs/applications/accelicity-knight-application-draft.docx
@@ -758,7 +758,7 @@
           <w:sz w:val="24"/>
           <w:sz-cs w:val="24"/>
         </w:rPr>
-        <w:t xml:space="preserve">These responses assume the project is being positioned primarily within a civic participation / local democracy / community coordination focus area.</w:t>
+        <w:t xml:space="preserve">These responses assume the project is being positioned primarily within Knight's focus on cultivating connection through arts, culture, and the places that bring people together, with secondary relevance to creating pathways for economic opportunity.</w:t>
       </w:r>
     </w:p>
     <w:p>
@@ -912,29 +912,51 @@
           <w:sz w:val="24"/>
           <w:sz-cs w:val="24"/>
         </w:rPr>
-        <w:t xml:space="preserve">We expect this project to create a more participatory and better coordinated model of community contribution around local public priorities. Specifically, we expect to create clearer pathways for residents to contribute to community life, stronger coordination between local institutions and public-service organizations, and more visible public value generated through structured civic participation.</w:t>
-      </w:r>
-    </w:p>
-    <w:p>
-      <w:pPr/>
-      <w:r>
-        <w:rPr>
-          <w:rFonts w:ascii="Helvetica Light" w:hAnsi="Helvetica Light" w:cs="Helvetica Light"/>
-          <w:sz w:val="24"/>
-          <w:sz-cs w:val="24"/>
-        </w:rPr>
-        <w:t xml:space="preserve"/>
-      </w:r>
-    </w:p>
-    <w:p>
-      <w:pPr/>
-      <w:r>
-        <w:rPr>
-          <w:rFonts w:ascii="Helvetica Light" w:hAnsi="Helvetica Light" w:cs="Helvetica Light"/>
-          <w:sz w:val="24"/>
-          <w:sz-cs w:val="24"/>
-        </w:rPr>
-        <w:t xml:space="preserve">We will know it worked if we see measurable increases in participation, task completion, institutional coordination, and successful redemption of civic credits through local offerings, along with qualitative evidence that residents and partner organizations found the system more accessible, motivating, and administratively useful than existing fragmented approaches. Success will also be reflected in whether the pilot produces a repeatable governance and operating model that can be adapted by other communities.</w:t>
+        <w:t xml:space="preserve">This project most strongly aligns with Knight's focus on cultivating connection through arts, culture, and the places that bring people together, with secondary relevance to creating pathways for economic opportunity. City/Sync is designed to help residents, local organizations, cultural institutions, community-serving businesses, and public-sector partners coordinate around shared public work in the places where civic life happens: parks, libraries, neighborhood corridors, community events, public spaces, and trusted local institutions.</w:t>
+      </w:r>
+    </w:p>
+    <w:p>
+      <w:pPr/>
+      <w:r>
+        <w:rPr>
+          <w:rFonts w:ascii="Helvetica Light" w:hAnsi="Helvetica Light" w:cs="Helvetica Light"/>
+          <w:sz w:val="24"/>
+          <w:sz-cs w:val="24"/>
+        </w:rPr>
+        <w:t xml:space="preserve"/>
+      </w:r>
+    </w:p>
+    <w:p>
+      <w:pPr/>
+      <w:r>
+        <w:rPr>
+          <w:rFonts w:ascii="Helvetica Light" w:hAnsi="Helvetica Light" w:cs="Helvetica Light"/>
+          <w:sz w:val="24"/>
+          <w:sz-cs w:val="24"/>
+        </w:rPr>
+        <w:t xml:space="preserve">The specific change we expect to create is a stronger, more visible network of community participation. Instead of civic contribution remaining scattered across isolated volunteer programs, informal outreach, and disconnected nonprofit efforts, City/Sync gives communities a shared coordination layer for identifying public needs, issuing tasks, validating contribution, and recognizing the people and organizations creating local value. We expect this to make community spaces more active, cared for, and connected while giving residents clearer pathways to participate in shaping the places they use every day.</w:t>
+      </w:r>
+    </w:p>
+    <w:p>
+      <w:pPr/>
+      <w:r>
+        <w:rPr>
+          <w:rFonts w:ascii="Helvetica Light" w:hAnsi="Helvetica Light" w:cs="Helvetica Light"/>
+          <w:sz w:val="24"/>
+          <w:sz-cs w:val="24"/>
+        </w:rPr>
+        <w:t xml:space="preserve"/>
+      </w:r>
+    </w:p>
+    <w:p>
+      <w:pPr/>
+      <w:r>
+        <w:rPr>
+          <w:rFonts w:ascii="Helvetica Light" w:hAnsi="Helvetica Light" w:cs="Helvetica Light"/>
+          <w:sz w:val="24"/>
+          <w:sz-cs w:val="24"/>
+        </w:rPr>
+        <w:t xml:space="preserve">We will know it worked if we see measurable increases in resident participation, repeat engagement, task completion, verified civic contributions, partner-organization activity, and redemption of civic credits through local offerings. We will also evaluate qualitative outcomes through feedback from participants and partner organizations, including whether residents felt a stronger sense of belonging, whether local organizations found coordination easier, and whether the pilot helped make public contribution more visible and accessible than existing fragmented approaches.</w:t>
       </w:r>
     </w:p>
     <w:p>

</xml_diff>